<commit_message>
feat: rebuild Holiday Data and AI Camp 2026 materials
</commit_message>
<xml_diff>
--- a/Schools_ML_Track/camp_2026/marketing/Parent_Student_One_Pager.docx
+++ b/Schools_ML_Track/camp_2026/marketing/Parent_Student_One_Pager.docx
@@ -25,7 +25,7 @@
     </w:p>
     <w:p>
       <w:r>
-        <w:t>Machine Learning: build and test prediction models using Python, Jupyter, pandas and scikit-learn. Data Analysis: turn data into findings using Python, Jupyter, pandas, matplotlib and SQL. No coding experience needed.</w:t>
+        <w:t>Machine Learning: build and test prediction models using Python, Jupyter, NumPy, pandas and scikit-learn. Python for Data Analysis: turn data into findings using Python, Jupyter, NumPy, pandas, matplotlib and seaborn. No coding experience needed.</w:t>
       </w:r>
     </w:p>
     <w:p>
@@ -158,7 +158,7 @@
                 <w:color w:val="FFFFFF"/>
                 <w:sz w:val="18"/>
               </w:rPr>
-              <w:t>Data Analysis</w:t>
+              <w:t>Python for Data Analysis</w:t>
             </w:r>
           </w:p>
         </w:tc>
@@ -348,7 +348,7 @@
                 <w:color w:val="183044"/>
                 <w:sz w:val="18"/>
               </w:rPr>
-              <w:t>pandas, statistics, cleaning and charts</w:t>
+              <w:t>pandas, cleaning and charts</w:t>
             </w:r>
           </w:p>
         </w:tc>
@@ -443,7 +443,7 @@
                 <w:color w:val="183044"/>
                 <w:sz w:val="18"/>
               </w:rPr>
-              <w:t>SQL queries, joins and result checks</w:t>
+              <w:t>NumPy, seaborn, merges and result checks</w:t>
             </w:r>
           </w:p>
         </w:tc>
@@ -580,10 +580,10 @@
         <w:rPr>
           <w:b/>
         </w:rPr>
-        <w:t xml:space="preserve">Fees per learner  </w:t>
+        <w:t xml:space="preserve">Fee and venue  </w:t>
       </w:r>
       <w:r>
-        <w:t>Entire programme: UGX 800,000 in a group of exactly five. Private/semi-private: UGX 1,000,000 each for one or two learners. Groups of three or four: request a quote.</w:t>
+        <w:t>Entire programme: UGX 1,000,000 per learner, the same for any group of one to five. Venue: The National ICT Innovation Hub, Nakawa.</w:t>
       </w:r>
     </w:p>
     <w:p>

</xml_diff>